<commit_message>
docs(sprint-124): renderer checkpoint passed; Word copy of fixture 11
Jarmo approved docx-preview 0.4.1 with Word's page markers honoured only
where a document has them, and the 88 % alias for Office-only fonts.
No LibreOffice path for now; Sprint 125 follows right after this one.
The ground-truth script now addresses Word documents by name (a crash
put a recovery window in front) and can redo single fixtures. Word's
owner lock files are ignored.

Co-Authored-By: Claude Opus 5.5 <noreply@anthropic.com>
</commit_message>
<xml_diff>
--- a/docs/development/releases/v1.12.0/sprint-124-word-preview-fidelity/research/corpus/word/01-headings-styles.docx
+++ b/docs/development/releases/v1.12.0/sprint-124-word-preview-fidelity/research/corpus/word/01-headings-styles.docx
@@ -432,10 +432,10 @@
 <file path=word/numbering.xml><?xml version="1.0" encoding="utf-8"?>
 <w:numbering xmlns:wpc="http://schemas.microsoft.com/office/word/2010/wordprocessingCanvas" xmlns:cx="http://schemas.microsoft.com/office/drawing/2014/chartex" xmlns:cx1="http://schemas.microsoft.com/office/drawing/2015/9/8/chartex" xmlns:cx2="http://schemas.microsoft.com/office/drawing/2015/10/21/chartex" xmlns:cx3="http://schemas.microsoft.com/office/drawing/2016/5/9/chartex" xmlns:cx4="http://schemas.microsoft.com/office/drawing/2016/5/10/chartex" xmlns:cx5="http://schemas.microsoft.com/office/drawing/2016/5/11/chartex" xmlns:cx6="http://schemas.microsoft.com/office/drawing/2016/5/12/chartex" xmlns:cx7="http://schemas.microsoft.com/office/drawing/2016/5/13/chartex" xmlns:cx8="http://schemas.microsoft.com/office/drawing/2016/5/14/chartex" xmlns:mc="http://schemas.openxmlformats.org/markup-compatibility/2006" xmlns:m="http://schemas.openxmlformats.org/officeDocument/2006/math" xmlns:aink="http://schemas.microsoft.com/office/drawing/2016/ink" xmlns:am3d="http://schemas.microsoft.com/office/drawing/2017/model3d" xmlns:oel="http://schemas.microsoft.com/office/2019/extlst" xmlns:r="http://schemas.openxmlformats.org/officeDocument/2006/relationships" xmlns:wp14="http://schemas.microsoft.com/office/word/2010/wordprocessingDrawing" xmlns:wp="http://schemas.openxmlformats.org/drawingml/2006/wordprocessingDrawing" xmlns:wpg="http://schemas.microsoft.com/office/word/2010/wordprocessingGroup" xmlns:wpi="http://schemas.microsoft.com/office/word/2010/wordprocessingInk" xmlns:wps="http://schemas.microsoft.com/office/word/2010/wordprocessingShape" xmlns:o="urn:schemas-microsoft-com:office:office" xmlns:v="urn:schemas-microsoft-com:vml" xmlns:w10="urn:schemas-microsoft-com:office:word" xmlns:w="http://schemas.openxmlformats.org/wordprocessingml/2006/main" xmlns:w14="http://schemas.microsoft.com/office/word/2010/wordml" xmlns:w15="http://schemas.microsoft.com/office/word/2012/wordml" xmlns:w16cex="http://schemas.microsoft.com/office/word/2018/wordml/cex" xmlns:w16cid="http://schemas.microsoft.com/office/word/2016/wordml/cid" xmlns:w16="http://schemas.microsoft.com/office/word/2018/wordml" xmlns:w16sdtdh="http://schemas.microsoft.com/office/word/2020/wordml/sdtdatahash" xmlns:w16sdtfl="http://schemas.microsoft.com/office/word/2024/wordml/sdtformatlock" xmlns:w16se="http://schemas.microsoft.com/office/word/2015/wordml/symex" xmlns:w16du="http://schemas.microsoft.com/office/word/2023/wordml/word16du" xmlns:wne="http://schemas.microsoft.com/office/word/2006/wordml" mc:Ignorable="w14 w15 w16se w16cid w16 w16cex w16sdtdh w16sdtfl w16du wp14">
   <w:abstractNum w:abstractNumId="0" w15:restartNumberingAfterBreak="0">
-    <w:nsid w:val="47DA3BDE"/>
+    <w:nsid w:val="7A0157E5"/>
     <w:multiLevelType w:val="hybridMultilevel"/>
-    <w:tmpl w:val="000E7074"/>
-    <w:lvl w:ilvl="0" w:tplc="6E448A66">
+    <w:tmpl w:val="4B1CF9C4"/>
+    <w:lvl w:ilvl="0" w:tplc="931E725A">
       <w:start w:val="1"/>
       <w:numFmt w:val="bullet"/>
       <w:lvlText w:val="●"/>
@@ -444,7 +444,7 @@
         <w:ind w:left="720" w:hanging="360"/>
       </w:pPr>
     </w:lvl>
-    <w:lvl w:ilvl="1" w:tplc="1206BC8A">
+    <w:lvl w:ilvl="1" w:tplc="464434FC">
       <w:start w:val="1"/>
       <w:numFmt w:val="bullet"/>
       <w:lvlText w:val="○"/>
@@ -453,7 +453,7 @@
         <w:ind w:left="1440" w:hanging="360"/>
       </w:pPr>
     </w:lvl>
-    <w:lvl w:ilvl="2" w:tplc="75E0737A">
+    <w:lvl w:ilvl="2" w:tplc="0352D344">
       <w:start w:val="1"/>
       <w:numFmt w:val="bullet"/>
       <w:lvlText w:val="■"/>
@@ -462,7 +462,7 @@
         <w:ind w:left="2160" w:hanging="360"/>
       </w:pPr>
     </w:lvl>
-    <w:lvl w:ilvl="3" w:tplc="9B966CA0">
+    <w:lvl w:ilvl="3" w:tplc="51548E28">
       <w:start w:val="1"/>
       <w:numFmt w:val="bullet"/>
       <w:lvlText w:val="●"/>
@@ -471,7 +471,7 @@
         <w:ind w:left="2880" w:hanging="360"/>
       </w:pPr>
     </w:lvl>
-    <w:lvl w:ilvl="4" w:tplc="B1DCE8C6">
+    <w:lvl w:ilvl="4" w:tplc="1F4636DA">
       <w:start w:val="1"/>
       <w:numFmt w:val="bullet"/>
       <w:lvlText w:val="○"/>
@@ -480,7 +480,7 @@
         <w:ind w:left="3600" w:hanging="360"/>
       </w:pPr>
     </w:lvl>
-    <w:lvl w:ilvl="5" w:tplc="B7C697E0">
+    <w:lvl w:ilvl="5" w:tplc="CAACDEE8">
       <w:start w:val="1"/>
       <w:numFmt w:val="bullet"/>
       <w:lvlText w:val="■"/>
@@ -489,7 +489,7 @@
         <w:ind w:left="4320" w:hanging="360"/>
       </w:pPr>
     </w:lvl>
-    <w:lvl w:ilvl="6" w:tplc="E054B4C2">
+    <w:lvl w:ilvl="6" w:tplc="05E8F046">
       <w:start w:val="1"/>
       <w:numFmt w:val="bullet"/>
       <w:lvlText w:val="●"/>
@@ -498,7 +498,7 @@
         <w:ind w:left="5040" w:hanging="360"/>
       </w:pPr>
     </w:lvl>
-    <w:lvl w:ilvl="7" w:tplc="0A32949E">
+    <w:lvl w:ilvl="7" w:tplc="4170C9DA">
       <w:start w:val="1"/>
       <w:numFmt w:val="bullet"/>
       <w:lvlText w:val="●"/>
@@ -507,7 +507,7 @@
         <w:ind w:left="5760" w:hanging="360"/>
       </w:pPr>
     </w:lvl>
-    <w:lvl w:ilvl="8" w:tplc="D62A8D90">
+    <w:lvl w:ilvl="8" w:tplc="38F46E24">
       <w:start w:val="1"/>
       <w:numFmt w:val="bullet"/>
       <w:lvlText w:val="●"/>
@@ -517,7 +517,7 @@
       </w:pPr>
     </w:lvl>
   </w:abstractNum>
-  <w:num w:numId="1" w16cid:durableId="1399590124">
+  <w:num w:numId="1" w16cid:durableId="462231034">
     <w:abstractNumId w:val="0"/>
     <w:lvlOverride w:ilvl="0">
       <w:startOverride w:val="1"/>

</xml_diff>